<commit_message>
Restructure report v2.8: single screening funnel with selectivity exploration in §5
- Remove dual Branch A/B framing from abstract, main text, and Appendix A
- Main funnel: ML → Glide (4979) → MD shortlist (157→25→16) → purchase (10)
- Move pass_selectivity/Tier stats to §5.4 as failed exploration record
- Update popular-science Word doc and data tables to match (rename CSVs, regen figures)

Co-authored-by: 1280602962-debug <1280602962-debug@users.noreply.github.com>
</commit_message>
<xml_diff>
--- a/JNK1_Selectivity_Project/docs/popular_science/JNK1筛选项目通俗解读报告.docx
+++ b/JNK1_Selectivity_Project/docs/popular_science/JNK1筛选项目通俗解读报告.docx
@@ -23,7 +23,7 @@
     </w:p>
     <w:p>
       <w:r>
-        <w:t>技术报告原文：docs/JNK1_PROJECT_REPORT.md（v2.7）</w:t>
+        <w:t>技术报告原文：docs/JNK1_PROJECT_REPORT.md（v2.8）</w:t>
       </w:r>
     </w:p>
     <w:p>
@@ -99,22 +99,22 @@
         <w:pStyle w:val="Heading1"/>
       </w:pPr>
       <w:r>
-        <w:t>3. 总体流程：为什么报告里会有“分支 A”和“分支 B”</w:t>
+        <w:t>3. 总体流程：从 5000 个分子到 10 个采购</w:t>
       </w:r>
     </w:p>
     <w:p>
       <w:r>
-        <w:t>整个筛选流程可以概括为：机器学习粗筛 → Glide XP 三亚型对接 → 分支 A 遗留选择性标签分析 / 分支 B MD 短名单筛选 → ADMET 成药性过滤 → 分子动力学验证 → 采购 10 个分子做实验。端到端数量是：4983 个进入对接库，4979 个有有效对接结果，分支 B 中 157 个进入 ADMET 前短名单，25 个进入 ADMET 后 shortlist，16 个进入 MD，最终推荐 10 个采购。</w:t>
+        <w:t>整个筛选流程可以概括为一条主线：机器学习粗筛 → Glide XP 三亚型对接 → pose QC 与 JNK1 活性筛选 → ADMET 成药性过滤 → 分子动力学验证 → 采购 10 个分子做实验。端到端数量是：4983 个进入对接库，4979 个有有效对接结果，157 个进入 ADMET 前短名单，25 个进入 ADMET 后 shortlist，16 个进入 MD，最终推荐 10 个采购。</w:t>
       </w:r>
     </w:p>
     <w:p>
       <w:r>
-        <w:t>分支 A 是项目早期留下来的探索性分析。它根据对接分、MM-GBSA 差值和接触特征给分子打 pass_selectivity 或 Tier 标签。例如分支 A 得到 233 个 pass_selectivity 分子，Tier 1′ 为 57 个。但后续 benchmark 验证证明，这些标签不能可靠预测真实的 JNK1/JNK2/JNK3 选择性。因此分支 A 的结果只作为“历史记录”和“探索性排序”，不能决定哪些分子进入 MD 或采购。</w:t>
+        <w:t>主线筛选不使用 pass_selectivity、Tier 1′、Tier 2 或 Δsel 方向，而是用 JNK1 活性门槛、pose 质量、ADMET 和 MD pose QC 来选择要做实验的分子。这解释了为什么 2231 虽然是 Tier 3、pass_selectivity 为 No，却仍然可以进入 MD：2231 凭 JNK1 对接分和 pose QC 满足 MD 短名单条件，而非依赖选择性探索标签。</w:t>
       </w:r>
     </w:p>
     <w:p>
       <w:r>
-        <w:t>分支 B 才是真正的采购决策链。它不读取 pass_selectivity、Tier 1′、Tier 2 或 Δsel 方向，而是用 JNK1 活性门槛、pose 质量、ADMET 和 MD pose QC 来选择要做实验的分子。这个拆分非常关键，因为它解释了为什么 2231 虽然是 Tier 3、pass_selectivity 为 No，却仍然可以进入 MD：2231 走的是分支 B，而不是分支 A。</w:t>
+        <w:t>项目早期曾尝试用对接分、MM-GBSA 差值和接触特征给分子打 pass_selectivity 或 Tier 标签，得到 233 个 pass_selectivity 分子、Tier 1′ 为 57 个。但后续 benchmark 验证证明这些标签不能可靠预测真实的 JNK1/JNK2/JNK3 选择性。这些失败的探索尝试完整保留于技术报告第五章，供回顾分析，但不参与采购决策。</w:t>
       </w:r>
     </w:p>
     <w:p/>
@@ -196,7 +196,7 @@
     </w:p>
     <w:p>
       <w:r>
-        <w:t>Benchmark 标定显示，Δsel_MMGBSA 的 |Δsel| 中位数噪声为 8.13 kcal/mol，而早期门槛只有 2.0 kcal/mol，远低于噪声水平。MM-GBSA 方向准确率也只有 43%。因此，Δsel_MMGBSA 不再作为选择性硬筛。但 MMGBSA_JNK1 单点活性门槛仍可用于分支 B，因为它回答的是“这个分子是否可能结合 JNK1”，而不是“它是否选择性偏向 JNK1”。</w:t>
+        <w:t>Benchmark 标定显示，Δsel_MMGBSA 的 |Δsel| 中位数噪声为 8.13 kcal/mol，而早期门槛只有 2.0 kcal/mol，远低于噪声水平。MM-GBSA 方向准确率也只有 43%。因此，Δsel_MMGBSA 不再作为选择性硬筛。但 MMGBSA_JNK1 单点活性门槛仍可用于 MD 短名单，因为它回答的是“这个分子是否可能结合 JNK1”，而不是“它是否选择性偏向 JNK1”。</w:t>
       </w:r>
     </w:p>
     <w:p>
@@ -215,7 +215,7 @@
     </w:p>
     <w:p>
       <w:r>
-        <w:t>分支 B 的 MD 短名单不是从 pass_selectivity 来的，而是从实际可用于采购和验证的角度设计。首先，4983 个 F0 分子经过 pose QC，3125 个通过；再经过 JNK1 活性和配体效率过滤，182 个通过；F1 与 F2 同时满足后为 157 个；再经过 QikProp ADMET 过滤和分组策略，得到 25 个 shortlist。</w:t>
+        <w:t>MD 短名单不是从 pass_selectivity 来的，而是从实际可用于采购和验证的角度设计。首先，4983 个 F0 分子经过 pose QC，3125 个通过；再经过 JNK1 活性和配体效率过滤，182 个通过；F1 与 F2 同时满足后为 157 个；再经过 QikProp ADMET 过滤和分组策略，得到 25 个 shortlist。</w:t>
       </w:r>
     </w:p>
     <w:p>
@@ -268,7 +268,7 @@
     </w:p>
     <w:p>
       <w:r>
-        <w:t>2231 是一个特殊案例。它在分支 A 中是 Tier 3、pass_selectivity 为 No，但在分支 B 中通过 JNK1 活性门槛和 pose QC，进入 25 个 shortlist，并因 G2 配额进入 MD。短 MD 显示它在 JNK1 上 pose 相对更稳，所以项目又为 2231 补做了 200 ns Amber 延伸 MD，三个亚型各一条轨迹。</w:t>
+        <w:t>2231 是一个特殊案例。它在选择性探索中是 Tier 3、pass_selectivity 为 No，但通过 JNK1 活性门槛和 pose QC 进入 25 个 shortlist，并因 G2 配额进入 MD。短 MD 显示它在 JNK1 上 pose 相对更稳，所以项目又为 2231 补做了 200 ns Amber 延伸 MD，三个亚型各一条轨迹。</w:t>
       </w:r>
     </w:p>
     <w:p>
@@ -617,88 +617,6 @@
               <w:rPr>
                 <w:sz w:val="16"/>
               </w:rPr>
-              <w:t>VSW pass_selectivity(遗留探索)</w:t>
-            </w:r>
-          </w:p>
-        </w:tc>
-        <w:tc>
-          <w:tcPr>
-            <w:tcW w:type="dxa" w:w="2880"/>
-          </w:tcPr>
-          <w:p>
-            <w:r>
-              <w:rPr>
-                <w:sz w:val="16"/>
-              </w:rPr>
-              <w:t>233</w:t>
-            </w:r>
-          </w:p>
-        </w:tc>
-        <w:tc>
-          <w:tcPr>
-            <w:tcW w:type="dxa" w:w="2880"/>
-          </w:tcPr>
-          <w:p>
-            <w:r>
-              <w:rPr>
-                <w:sz w:val="16"/>
-              </w:rPr>
-              <w:t>同上;未用于MD短名单</w:t>
-            </w:r>
-          </w:p>
-        </w:tc>
-      </w:tr>
-      <w:tr>
-        <w:tc>
-          <w:tcPr>
-            <w:tcW w:type="dxa" w:w="2880"/>
-          </w:tcPr>
-          <w:p>
-            <w:r>
-              <w:rPr>
-                <w:sz w:val="16"/>
-              </w:rPr>
-              <w:t>VSW Tier 1′</w:t>
-            </w:r>
-          </w:p>
-        </w:tc>
-        <w:tc>
-          <w:tcPr>
-            <w:tcW w:type="dxa" w:w="2880"/>
-          </w:tcPr>
-          <w:p>
-            <w:r>
-              <w:rPr>
-                <w:sz w:val="16"/>
-              </w:rPr>
-              <w:t>57</w:t>
-            </w:r>
-          </w:p>
-        </w:tc>
-        <w:tc>
-          <w:tcPr>
-            <w:tcW w:type="dxa" w:w="2880"/>
-          </w:tcPr>
-          <w:p>
-            <w:r>
-              <w:rPr>
-                <w:sz w:val="16"/>
-              </w:rPr>
-              <w:t>同上</w:t>
-            </w:r>
-          </w:p>
-        </w:tc>
-      </w:tr>
-      <w:tr>
-        <w:tc>
-          <w:tcPr>
-            <w:tcW w:type="dxa" w:w="2880"/>
-          </w:tcPr>
-          <w:p>
-            <w:r>
-              <w:rPr>
-                <w:sz w:val="16"/>
-              </w:rPr>
               <w:t>MD短名单 F1∧F2(ADMET前)</w:t>
             </w:r>
           </w:p>
@@ -2584,7 +2502,7 @@
         <w:pStyle w:val="Heading3"/>
       </w:pPr>
       <w:r>
-        <w:t>表6 MD 短名单漏斗（分支 B）</w:t>
+        <w:t>表6 MD 短名单漏斗</w:t>
       </w:r>
     </w:p>
     <w:tbl>
@@ -2856,7 +2774,7 @@
         <w:pStyle w:val="Heading3"/>
       </w:pPr>
       <w:r>
-        <w:t>表7 VSW Tier 分布（分支 A，探索用）</w:t>
+        <w:t>表7 VSW Tier 分布（选择性探索，未用于采购）</w:t>
       </w:r>
     </w:p>
     <w:tbl>
@@ -11408,7 +11326,7 @@
         <w:pStyle w:val="Heading3"/>
       </w:pPr>
       <w:r>
-        <w:t>表13 VSW 分支 A 各过滤阶段数量</w:t>
+        <w:t>表13 VSW 选择性探索各过滤阶段数量</w:t>
       </w:r>
     </w:p>
     <w:tbl>
@@ -12654,88 +12572,6 @@
                 <w:sz w:val="16"/>
               </w:rPr>
               <w:t>JNK1_SELECTIVITY_FINAL_REPORT_41d9.md</w:t>
-            </w:r>
-          </w:p>
-        </w:tc>
-      </w:tr>
-      <w:tr>
-        <w:tc>
-          <w:tcPr>
-            <w:tcW w:type="dxa" w:w="2880"/>
-          </w:tcPr>
-          <w:p>
-            <w:r>
-              <w:rPr>
-                <w:sz w:val="16"/>
-              </w:rPr>
-              <w:t>VSW pass_selectivity(遗留探索)</w:t>
-            </w:r>
-          </w:p>
-        </w:tc>
-        <w:tc>
-          <w:tcPr>
-            <w:tcW w:type="dxa" w:w="2880"/>
-          </w:tcPr>
-          <w:p>
-            <w:r>
-              <w:rPr>
-                <w:sz w:val="16"/>
-              </w:rPr>
-              <w:t>233</w:t>
-            </w:r>
-          </w:p>
-        </w:tc>
-        <w:tc>
-          <w:tcPr>
-            <w:tcW w:type="dxa" w:w="2880"/>
-          </w:tcPr>
-          <w:p>
-            <w:r>
-              <w:rPr>
-                <w:sz w:val="16"/>
-              </w:rPr>
-              <w:t>同上;未用于MD短名单</w:t>
-            </w:r>
-          </w:p>
-        </w:tc>
-      </w:tr>
-      <w:tr>
-        <w:tc>
-          <w:tcPr>
-            <w:tcW w:type="dxa" w:w="2880"/>
-          </w:tcPr>
-          <w:p>
-            <w:r>
-              <w:rPr>
-                <w:sz w:val="16"/>
-              </w:rPr>
-              <w:t>VSW Tier 1′</w:t>
-            </w:r>
-          </w:p>
-        </w:tc>
-        <w:tc>
-          <w:tcPr>
-            <w:tcW w:type="dxa" w:w="2880"/>
-          </w:tcPr>
-          <w:p>
-            <w:r>
-              <w:rPr>
-                <w:sz w:val="16"/>
-              </w:rPr>
-              <w:t>57</w:t>
-            </w:r>
-          </w:p>
-        </w:tc>
-        <w:tc>
-          <w:tcPr>
-            <w:tcW w:type="dxa" w:w="2880"/>
-          </w:tcPr>
-          <w:p>
-            <w:r>
-              <w:rPr>
-                <w:sz w:val="16"/>
-              </w:rPr>
-              <w:t>同上</w:t>
             </w:r>
           </w:p>
         </w:tc>
@@ -32587,7 +32423,7 @@
         <w:pStyle w:val="Heading3"/>
       </w:pPr>
       <w:r>
-        <w:t>16_VSW分支A各阶段数量.csv</w:t>
+        <w:t>16_VSW选择性探索各阶段数量.csv</w:t>
       </w:r>
     </w:p>
     <w:p>
@@ -32595,7 +32431,7 @@
         <w:pStyle w:val="Heading3"/>
       </w:pPr>
       <w:r>
-        <w:t>16_VSW分支A各阶段数量.csv（完整表）</w:t>
+        <w:t>16_VSW选择性探索各阶段数量.csv（完整表）</w:t>
       </w:r>
     </w:p>
     <w:tbl>
@@ -33139,7 +32975,7 @@
         <w:pStyle w:val="Heading3"/>
       </w:pPr>
       <w:r>
-        <w:t>18_MD分支B漏斗.csv</w:t>
+        <w:t>18_MD短名单漏斗.csv</w:t>
       </w:r>
     </w:p>
     <w:p>
@@ -33147,7 +32983,7 @@
         <w:pStyle w:val="Heading3"/>
       </w:pPr>
       <w:r>
-        <w:t>18_MD分支B漏斗.csv（完整表）</w:t>
+        <w:t>18_MD短名单漏斗.csv（完整表）</w:t>
       </w:r>
     </w:p>
     <w:tbl>

</xml_diff>